<commit_message>
Agregar enlaces de descarga
</commit_message>
<xml_diff>
--- a/docs/Documento_Sistema_Gestion_Productos.docx
+++ b/docs/Documento_Sistema_Gestion_Productos.docx
@@ -9400,7 +9400,7 @@
         <w:pStyle w:val="Compact"/>
       </w:pPr>
       <w:r>
-        <w:t xml:space="preserve">Abrir el enlace de descarga: [PEGAR AQUÍ URL DE LA RELEASE]</w:t>
+        <w:t xml:space="preserve">Abrir el enlace de descarga: https://github.com/Gabriel-Nieves-source/sistema-gestion-productos/releases/latest</w:t>
       </w:r>
     </w:p>
     <w:p>
@@ -9523,7 +9523,7 @@
         <w:pStyle w:val="FirstParagraph"/>
       </w:pPr>
       <w:r>
-        <w:t xml:space="preserve">[PEGAR AQUÍ URL DEL REPOSITORIO]</w:t>
+        <w:t xml:space="preserve">https://github.com/Gabriel-Nieves-source/sistema-gestion-productos</w:t>
       </w:r>
     </w:p>
     <w:bookmarkEnd w:id="42"/>

</xml_diff>